<commit_message>
added data generator and enumaration evaluations
</commit_message>
<xml_diff>
--- a/Prompts.docx
+++ b/Prompts.docx
@@ -92,7 +92,15 @@
         <w:t xml:space="preserve">- Relationship metadata (related entity, cardinality, direction). </w:t>
       </w:r>
       <w:r>
-        <w:t>target stores the id of the other entity and name in type relationship store the type of the relationship. see example: "@type": "Relationship", "name": "</w:t>
+        <w:t>target stores the id of the other entity and name in type relationship store the type of the relationship. see example</w:t>
+      </w:r>
+      <w:proofErr w:type="gramStart"/>
+      <w:r>
+        <w:t>: "@</w:t>
+      </w:r>
+      <w:proofErr w:type="gramEnd"/>
+      <w:r>
+        <w:t>type": "Relationship", "name": "</w:t>
       </w:r>
       <w:proofErr w:type="spellStart"/>
       <w:r>
@@ -108,7 +116,23 @@
       </w:r>
       <w:proofErr w:type="spellEnd"/>
       <w:r>
-        <w:t>": "Has values of", "description": "The equipment property values of this equipment.", "target": "dtmi:digitaltwins:isa95:EquipmentProperty;1"</w:t>
+        <w:t>": "Has values of", "description": "The equipment property values of this equipment.", "target": "</w:t>
+      </w:r>
+      <w:proofErr w:type="gramStart"/>
+      <w:r>
+        <w:t>dtmi:digitaltwins</w:t>
+      </w:r>
+      <w:proofErr w:type="gramEnd"/>
+      <w:r>
+        <w:t>:isa</w:t>
+      </w:r>
+      <w:proofErr w:type="gramStart"/>
+      <w:r>
+        <w:t>95:EquipmentProperty</w:t>
+      </w:r>
+      <w:proofErr w:type="gramEnd"/>
+      <w:r>
+        <w:t>;1"</w:t>
       </w:r>
     </w:p>
     <w:p>
@@ -119,7 +143,15 @@
     <w:p/>
     <w:p>
       <w:r>
-        <w:t>The backend must load and cache these JSON files at runtime.</w:t>
+        <w:t xml:space="preserve">The backend must load and </w:t>
+      </w:r>
+      <w:proofErr w:type="gramStart"/>
+      <w:r>
+        <w:t>cache</w:t>
+      </w:r>
+      <w:proofErr w:type="gramEnd"/>
+      <w:r>
+        <w:t xml:space="preserve"> these JSON files at runtime.</w:t>
       </w:r>
     </w:p>
     <w:p/>
@@ -253,7 +285,15 @@
     </w:p>
     <w:p>
       <w:r>
-        <w:t>- Fixed lookup values</w:t>
+        <w:t xml:space="preserve">- Fixed </w:t>
+      </w:r>
+      <w:proofErr w:type="gramStart"/>
+      <w:r>
+        <w:t>lookup</w:t>
+      </w:r>
+      <w:proofErr w:type="gramEnd"/>
+      <w:r>
+        <w:t xml:space="preserve"> values</w:t>
       </w:r>
     </w:p>
     <w:p>
@@ -347,7 +387,15 @@
     </w:p>
     <w:p>
       <w:r>
-        <w:t>- Maintain referential integrity using the defined relationships</w:t>
+        <w:t xml:space="preserve">- Maintain referential integrity using </w:t>
+      </w:r>
+      <w:proofErr w:type="gramStart"/>
+      <w:r>
+        <w:t>the defined</w:t>
+      </w:r>
+      <w:proofErr w:type="gramEnd"/>
+      <w:r>
+        <w:t xml:space="preserve"> relationships</w:t>
       </w:r>
     </w:p>
     <w:p>
@@ -469,8 +517,13 @@
       <w:r>
         <w:t xml:space="preserve"> Primary keys </w:t>
       </w:r>
-      <w:r>
-        <w:t>is the</w:t>
+      <w:proofErr w:type="gramStart"/>
+      <w:r>
+        <w:t>is</w:t>
+      </w:r>
+      <w:proofErr w:type="gramEnd"/>
+      <w:r>
+        <w:t xml:space="preserve"> the</w:t>
       </w:r>
       <w:r>
         <w:t xml:space="preserve"> PK </w:t>
@@ -526,7 +579,11 @@
     </w:p>
     <w:p>
       <w:r>
-        <w:t>- GET /entities/{</w:t>
+        <w:t>- GET /</w:t>
+      </w:r>
+      <w:proofErr w:type="gramStart"/>
+      <w:r>
+        <w:t>entities/{</w:t>
       </w:r>
       <w:proofErr w:type="spellStart"/>
       <w:r>
@@ -534,12 +591,20 @@
       </w:r>
       <w:proofErr w:type="spellEnd"/>
       <w:r>
-        <w:t>}/structure</w:t>
-      </w:r>
-    </w:p>
-    <w:p>
-      <w:r>
-        <w:t>- GET /entities/{</w:t>
+        <w:t>}/</w:t>
+      </w:r>
+      <w:proofErr w:type="gramEnd"/>
+      <w:r>
+        <w:t>structure</w:t>
+      </w:r>
+    </w:p>
+    <w:p>
+      <w:r>
+        <w:t>- GET /</w:t>
+      </w:r>
+      <w:proofErr w:type="gramStart"/>
+      <w:r>
+        <w:t>entities/{</w:t>
       </w:r>
       <w:proofErr w:type="spellStart"/>
       <w:r>
@@ -547,7 +612,11 @@
       </w:r>
       <w:proofErr w:type="spellEnd"/>
       <w:r>
-        <w:t>}/related</w:t>
+        <w:t>}/</w:t>
+      </w:r>
+      <w:proofErr w:type="gramEnd"/>
+      <w:r>
+        <w:t>related</w:t>
       </w:r>
     </w:p>
     <w:p>
@@ -654,7 +723,15 @@
     </w:p>
     <w:p>
       <w:r>
-        <w:t>- Use async/await everywhere</w:t>
+        <w:t>- Use async/</w:t>
+      </w:r>
+      <w:proofErr w:type="gramStart"/>
+      <w:r>
+        <w:t>await</w:t>
+      </w:r>
+      <w:proofErr w:type="gramEnd"/>
+      <w:r>
+        <w:t xml:space="preserve"> everywhere</w:t>
       </w:r>
     </w:p>
     <w:p/>
@@ -683,7 +760,15 @@
       </w:r>
       <w:proofErr w:type="spellEnd"/>
       <w:r>
-        <w:t xml:space="preserve"> of the Graph based in the Entity relationship. It should be possible to navigate and search in the graph. Each entity should have an arrow on the top – right side of the node. When click on arrow it should expand a tool tip with tabular structure / list of all properties / columns of the entity and related type and constraints.</w:t>
+        <w:t xml:space="preserve"> of the Graph based in the Entity relationship. It should be possible to navigate and search in the graph. Each entity should have an arrow on the top – right side of the node. When </w:t>
+      </w:r>
+      <w:proofErr w:type="gramStart"/>
+      <w:r>
+        <w:t>click</w:t>
+      </w:r>
+      <w:proofErr w:type="gramEnd"/>
+      <w:r>
+        <w:t xml:space="preserve"> on arrow it should expand a tool tip with tabular structure / list of all properties / columns of the entity and related type and constraints.</w:t>
       </w:r>
     </w:p>
     <w:p>
@@ -698,7 +783,15 @@
     </w:p>
     <w:p>
       <w:r>
-        <w:t xml:space="preserve">  - Show field list with properties their types and constraints</w:t>
+        <w:t xml:space="preserve">  - Show field list with </w:t>
+      </w:r>
+      <w:proofErr w:type="gramStart"/>
+      <w:r>
+        <w:t>properties</w:t>
+      </w:r>
+      <w:proofErr w:type="gramEnd"/>
+      <w:r>
+        <w:t xml:space="preserve"> their types and constraints</w:t>
       </w:r>
     </w:p>
     <w:p>
@@ -714,7 +807,15 @@
     <w:p/>
     <w:p>
       <w:r>
-        <w:t>## 2. PK Rule Builder UI in separate area.</w:t>
+        <w:t xml:space="preserve">## 2. PK Rule Builder UI in separate </w:t>
+      </w:r>
+      <w:proofErr w:type="gramStart"/>
+      <w:r>
+        <w:t>area</w:t>
+      </w:r>
+      <w:proofErr w:type="gramEnd"/>
+      <w:r>
+        <w:t>.</w:t>
       </w:r>
     </w:p>
     <w:p>
@@ -748,7 +849,15 @@
         <w:ind w:left="720"/>
       </w:pPr>
       <w:r>
-        <w:t>- Define formatting expression (`{Field}-{Seq:0000}`)</w:t>
+        <w:t>- Define formatting expression (`{Field}-{Seq:</w:t>
+      </w:r>
+      <w:proofErr w:type="gramStart"/>
+      <w:r>
+        <w:t>0000}`</w:t>
+      </w:r>
+      <w:proofErr w:type="gramEnd"/>
+      <w:r>
+        <w:t>)</w:t>
       </w:r>
     </w:p>
     <w:p>
@@ -1040,7 +1149,15 @@
     </w:p>
     <w:p>
       <w:r>
-        <w:t xml:space="preserve">   - 1:N → generate N children</w:t>
+        <w:t xml:space="preserve">   - </w:t>
+      </w:r>
+      <w:proofErr w:type="gramStart"/>
+      <w:r>
+        <w:t>1:N</w:t>
+      </w:r>
+      <w:proofErr w:type="gramEnd"/>
+      <w:r>
+        <w:t xml:space="preserve"> → generate N children</w:t>
       </w:r>
     </w:p>
     <w:p>
@@ -1128,7 +1245,15 @@
       </w:r>
       <w:proofErr w:type="spellEnd"/>
       <w:r>
-        <w:t xml:space="preserve">, AttributeDefinition, </w:t>
+        <w:t xml:space="preserve">, </w:t>
+      </w:r>
+      <w:proofErr w:type="spellStart"/>
+      <w:r>
+        <w:t>AttributeDefinition</w:t>
+      </w:r>
+      <w:proofErr w:type="spellEnd"/>
+      <w:r>
+        <w:t xml:space="preserve">, </w:t>
       </w:r>
       <w:proofErr w:type="spellStart"/>
       <w:r>
@@ -1275,26 +1400,71 @@
         <w:rPr>
           <w:highlight w:val="green"/>
         </w:rPr>
-        <w:t>Field Rules and Data generation:</w:t>
-      </w:r>
-    </w:p>
-    <w:p>
-      <w:r>
-        <w:t xml:space="preserve">In the generate data, </w:t>
+        <w:t xml:space="preserve">Field Rules and Data </w:t>
+      </w:r>
+      <w:proofErr w:type="gramStart"/>
+      <w:r>
+        <w:rPr>
+          <w:highlight w:val="green"/>
+        </w:rPr>
+        <w:t>generation</w:t>
+      </w:r>
+      <w:proofErr w:type="gramEnd"/>
+      <w:r>
+        <w:rPr>
+          <w:highlight w:val="green"/>
+        </w:rPr>
+        <w:t>:</w:t>
+      </w:r>
+    </w:p>
+    <w:p>
+      <w:proofErr w:type="gramStart"/>
+      <w:r>
+        <w:t>In the generate</w:t>
+      </w:r>
+      <w:proofErr w:type="gramEnd"/>
+      <w:r>
+        <w:t xml:space="preserve"> data</w:t>
+      </w:r>
+      <w:proofErr w:type="gramStart"/>
+      <w:r>
+        <w:t xml:space="preserve">, </w:t>
       </w:r>
       <w:proofErr w:type="spellStart"/>
       <w:r>
         <w:t>i</w:t>
       </w:r>
       <w:proofErr w:type="spellEnd"/>
-      <w:r>
-        <w:t xml:space="preserve"> want create a data generation scenario, means when </w:t>
+      <w:proofErr w:type="gramEnd"/>
+      <w:r>
+        <w:t xml:space="preserve"> want </w:t>
+      </w:r>
+      <w:proofErr w:type="gramStart"/>
+      <w:r>
+        <w:t>create</w:t>
+      </w:r>
+      <w:proofErr w:type="gramEnd"/>
+      <w:r>
+        <w:t xml:space="preserve"> a data generation scenario, </w:t>
+      </w:r>
+      <w:proofErr w:type="gramStart"/>
+      <w:r>
+        <w:t>means</w:t>
+      </w:r>
+      <w:proofErr w:type="gramEnd"/>
+      <w:r>
+        <w:t xml:space="preserve"> </w:t>
+      </w:r>
+      <w:proofErr w:type="gramStart"/>
+      <w:r>
+        <w:t xml:space="preserve">when </w:t>
       </w:r>
       <w:proofErr w:type="spellStart"/>
       <w:r>
         <w:t>i</w:t>
       </w:r>
       <w:proofErr w:type="spellEnd"/>
+      <w:proofErr w:type="gramEnd"/>
       <w:r>
         <w:t xml:space="preserve"> have selected </w:t>
       </w:r>
@@ -1304,29 +1474,52 @@
       </w:r>
       <w:proofErr w:type="spellEnd"/>
       <w:r>
-        <w:t xml:space="preserve"> entities and applied rules to fields of that entities, </w:t>
+        <w:t xml:space="preserve"> entities and applied rules to fields of </w:t>
+      </w:r>
+      <w:proofErr w:type="gramStart"/>
+      <w:r>
+        <w:t xml:space="preserve">that entities, </w:t>
       </w:r>
       <w:proofErr w:type="spellStart"/>
       <w:r>
         <w:t>i</w:t>
       </w:r>
       <w:proofErr w:type="spellEnd"/>
-      <w:r>
-        <w:t xml:space="preserve"> should be able to save that scenarios, so they can be repeated. When </w:t>
+      <w:proofErr w:type="gramEnd"/>
+      <w:r>
+        <w:t xml:space="preserve"> should be able to save that </w:t>
+      </w:r>
+      <w:proofErr w:type="gramStart"/>
+      <w:r>
+        <w:t>scenarios</w:t>
+      </w:r>
+      <w:proofErr w:type="gramEnd"/>
+      <w:r>
+        <w:t xml:space="preserve">, so they can be repeated. </w:t>
+      </w:r>
+      <w:proofErr w:type="gramStart"/>
+      <w:r>
+        <w:t xml:space="preserve">When </w:t>
       </w:r>
       <w:proofErr w:type="spellStart"/>
       <w:r>
         <w:t>i</w:t>
       </w:r>
       <w:proofErr w:type="spellEnd"/>
-      <w:r>
-        <w:t xml:space="preserve"> select the root and related entities </w:t>
+      <w:proofErr w:type="gramEnd"/>
+      <w:r>
+        <w:t xml:space="preserve"> select the root and related </w:t>
+      </w:r>
+      <w:proofErr w:type="gramStart"/>
+      <w:r>
+        <w:t xml:space="preserve">entities </w:t>
       </w:r>
       <w:proofErr w:type="spellStart"/>
       <w:r>
         <w:t>i</w:t>
       </w:r>
       <w:proofErr w:type="spellEnd"/>
+      <w:proofErr w:type="gramEnd"/>
       <w:r>
         <w:t xml:space="preserve"> should have the </w:t>
       </w:r>
@@ -1336,15 +1529,28 @@
       </w:r>
       <w:proofErr w:type="spellEnd"/>
       <w:r>
-        <w:t xml:space="preserve"> to say, which pk and field rules </w:t>
+        <w:t xml:space="preserve"> to say, which pk and field </w:t>
+      </w:r>
+      <w:proofErr w:type="gramStart"/>
+      <w:r>
+        <w:t xml:space="preserve">rules </w:t>
       </w:r>
       <w:proofErr w:type="spellStart"/>
       <w:r>
         <w:t>i</w:t>
       </w:r>
       <w:proofErr w:type="spellEnd"/>
-      <w:r>
-        <w:t xml:space="preserve"> want to apply on what entities and fields.</w:t>
+      <w:proofErr w:type="gramEnd"/>
+      <w:r>
+        <w:t xml:space="preserve"> want to apply </w:t>
+      </w:r>
+      <w:proofErr w:type="gramStart"/>
+      <w:r>
+        <w:t>on</w:t>
+      </w:r>
+      <w:proofErr w:type="gramEnd"/>
+      <w:r>
+        <w:t xml:space="preserve"> what entities and fields.</w:t>
       </w:r>
     </w:p>
     <w:p/>
@@ -1369,10 +1575,12 @@
         <w:t xml:space="preserve"> of the mapping file. </w:t>
       </w:r>
       <w:proofErr w:type="spellStart"/>
+      <w:proofErr w:type="gramStart"/>
       <w:r>
         <w:t>WHich</w:t>
       </w:r>
       <w:proofErr w:type="spellEnd"/>
+      <w:proofErr w:type="gramEnd"/>
       <w:r>
         <w:t xml:space="preserve"> is following: Source type,</w:t>
       </w:r>
@@ -1409,18 +1617,22 @@
         <w:t xml:space="preserve">Relationship Type. The Source Primary key is the </w:t>
       </w:r>
       <w:proofErr w:type="spellStart"/>
+      <w:proofErr w:type="gramStart"/>
       <w:r>
         <w:t>primaryKey</w:t>
       </w:r>
       <w:proofErr w:type="spellEnd"/>
+      <w:proofErr w:type="gramEnd"/>
       <w:r>
         <w:t xml:space="preserve"> of the source Entity the target primary key is the </w:t>
       </w:r>
       <w:proofErr w:type="spellStart"/>
+      <w:proofErr w:type="gramStart"/>
       <w:r>
         <w:t>primaryKey</w:t>
       </w:r>
       <w:proofErr w:type="spellEnd"/>
+      <w:proofErr w:type="gramEnd"/>
       <w:r>
         <w:t xml:space="preserve"> of the outbound relationship. the relationship type is defined based on the relationship between the entities, that information can be taken </w:t>
       </w:r>
@@ -1430,7 +1642,15 @@
       </w:r>
       <w:proofErr w:type="spellEnd"/>
       <w:r>
-        <w:t xml:space="preserve"> he relationship part of the </w:t>
+        <w:t xml:space="preserve"> </w:t>
+      </w:r>
+      <w:proofErr w:type="gramStart"/>
+      <w:r>
+        <w:t>he</w:t>
+      </w:r>
+      <w:proofErr w:type="gramEnd"/>
+      <w:r>
+        <w:t xml:space="preserve"> relationship part of the </w:t>
       </w:r>
       <w:proofErr w:type="spellStart"/>
       <w:r>
@@ -1443,16 +1663,34 @@
     </w:p>
     <w:p/>
     <w:p>
-      <w:r>
-        <w:t xml:space="preserve">can you adjust it. </w:t>
-      </w:r>
-      <w:proofErr w:type="spellStart"/>
+      <w:proofErr w:type="gramStart"/>
+      <w:r>
+        <w:t>can</w:t>
+      </w:r>
+      <w:proofErr w:type="gramEnd"/>
+      <w:r>
+        <w:t xml:space="preserve"> you adjust it. </w:t>
+      </w:r>
+      <w:proofErr w:type="spellStart"/>
+      <w:proofErr w:type="gramStart"/>
       <w:r>
         <w:t>i</w:t>
       </w:r>
       <w:proofErr w:type="spellEnd"/>
       <w:r>
-        <w:t xml:space="preserve"> want that the field configuration should be shown as </w:t>
+        <w:t xml:space="preserve"> want that</w:t>
+      </w:r>
+      <w:proofErr w:type="gramEnd"/>
+      <w:r>
+        <w:t xml:space="preserve"> the field configuration </w:t>
+      </w:r>
+      <w:proofErr w:type="gramStart"/>
+      <w:r>
+        <w:t>should be</w:t>
+      </w:r>
+      <w:proofErr w:type="gramEnd"/>
+      <w:r>
+        <w:t xml:space="preserve"> shown as </w:t>
       </w:r>
       <w:proofErr w:type="spellStart"/>
       <w:r>
@@ -1460,7 +1698,23 @@
       </w:r>
       <w:proofErr w:type="spellEnd"/>
       <w:r>
-        <w:t xml:space="preserve"> object in the visual navigation. also the </w:t>
+        <w:t xml:space="preserve"> object in </w:t>
+      </w:r>
+      <w:proofErr w:type="gramStart"/>
+      <w:r>
+        <w:t>the visual</w:t>
+      </w:r>
+      <w:proofErr w:type="gramEnd"/>
+      <w:r>
+        <w:t xml:space="preserve"> navigation. </w:t>
+      </w:r>
+      <w:proofErr w:type="gramStart"/>
+      <w:r>
+        <w:t>also</w:t>
+      </w:r>
+      <w:proofErr w:type="gramEnd"/>
+      <w:r>
+        <w:t xml:space="preserve"> the </w:t>
       </w:r>
       <w:proofErr w:type="spellStart"/>
       <w:r>
@@ -1472,13 +1726,26 @@
       </w:r>
       <w:r>
         <w:lastRenderedPageBreak/>
-        <w:t>of the relationship, name not the Display name. the mapping file which is between the entities should only show one relationship between the main and the related entity.</w:t>
-      </w:r>
-    </w:p>
-    <w:p/>
-    <w:p>
-      <w:r>
-        <w:t>the source and target primary key should be not the id rather the primary key of the entity. make sure it is clear from which entity the primary key comes</w:t>
+        <w:t xml:space="preserve">of the relationship, name not the Display name. </w:t>
+      </w:r>
+      <w:proofErr w:type="gramStart"/>
+      <w:r>
+        <w:t>the</w:t>
+      </w:r>
+      <w:proofErr w:type="gramEnd"/>
+      <w:r>
+        <w:t xml:space="preserve"> mapping file which is between the entities should only show one relationship between the main and the related entity.</w:t>
+      </w:r>
+    </w:p>
+    <w:p/>
+    <w:p>
+      <w:proofErr w:type="gramStart"/>
+      <w:r>
+        <w:t>the</w:t>
+      </w:r>
+      <w:proofErr w:type="gramEnd"/>
+      <w:r>
+        <w:t xml:space="preserve"> source and target primary key should be not the id rather the primary key of the entity. make sure it is clear from which entity the primary key comes</w:t>
       </w:r>
     </w:p>
     <w:p/>
@@ -1492,7 +1759,23 @@
     </w:p>
     <w:p>
       <w:r>
-        <w:t xml:space="preserve">I want you help me to generate new test data. I have following </w:t>
+        <w:t xml:space="preserve">I want you </w:t>
+      </w:r>
+      <w:proofErr w:type="gramStart"/>
+      <w:r>
+        <w:t>help</w:t>
+      </w:r>
+      <w:proofErr w:type="gramEnd"/>
+      <w:r>
+        <w:t xml:space="preserve"> me </w:t>
+      </w:r>
+      <w:proofErr w:type="gramStart"/>
+      <w:r>
+        <w:t>to generate</w:t>
+      </w:r>
+      <w:proofErr w:type="gramEnd"/>
+      <w:r>
+        <w:t xml:space="preserve"> new test data. I have following </w:t>
       </w:r>
       <w:proofErr w:type="spellStart"/>
       <w:r>
@@ -1508,15 +1791,28 @@
       </w:r>
       <w:proofErr w:type="spellEnd"/>
       <w:r>
-        <w:t xml:space="preserve">. I will give you some example files and </w:t>
+        <w:t xml:space="preserve">. I will give you some example files </w:t>
+      </w:r>
+      <w:proofErr w:type="gramStart"/>
+      <w:r>
+        <w:t xml:space="preserve">and </w:t>
       </w:r>
       <w:proofErr w:type="spellStart"/>
       <w:r>
         <w:t>i</w:t>
       </w:r>
       <w:proofErr w:type="spellEnd"/>
-      <w:r>
-        <w:t xml:space="preserve"> want you to generate me based on it similar data. Equipment </w:t>
+      <w:proofErr w:type="gramEnd"/>
+      <w:r>
+        <w:t xml:space="preserve"> want you to generate me based on </w:t>
+      </w:r>
+      <w:proofErr w:type="gramStart"/>
+      <w:r>
+        <w:t>it</w:t>
+      </w:r>
+      <w:proofErr w:type="gramEnd"/>
+      <w:r>
+        <w:t xml:space="preserve"> similar data. Equipment </w:t>
       </w:r>
       <w:proofErr w:type="spellStart"/>
       <w:r>
@@ -1532,7 +1828,31 @@
       </w:r>
       <w:proofErr w:type="spellEnd"/>
       <w:r>
-        <w:t xml:space="preserve">. I want have two Equipment Properties Temperature and Pressure as in the example files. The Id of the </w:t>
+        <w:t xml:space="preserve">. I want </w:t>
+      </w:r>
+      <w:proofErr w:type="gramStart"/>
+      <w:r>
+        <w:t>have</w:t>
+      </w:r>
+      <w:proofErr w:type="gramEnd"/>
+      <w:r>
+        <w:t xml:space="preserve"> two Equipment </w:t>
+      </w:r>
+      <w:proofErr w:type="gramStart"/>
+      <w:r>
+        <w:t>Properties</w:t>
+      </w:r>
+      <w:proofErr w:type="gramEnd"/>
+      <w:r>
+        <w:t xml:space="preserve"> Temperature and </w:t>
+      </w:r>
+      <w:proofErr w:type="gramStart"/>
+      <w:r>
+        <w:t>Pressure</w:t>
+      </w:r>
+      <w:proofErr w:type="gramEnd"/>
+      <w:r>
+        <w:t xml:space="preserve"> as in the example files. The Id of the </w:t>
       </w:r>
       <w:proofErr w:type="spellStart"/>
       <w:r>
@@ -1567,10 +1887,12 @@
         <w:t xml:space="preserve"> type e.g. Temperature. The </w:t>
       </w:r>
       <w:proofErr w:type="spellStart"/>
+      <w:proofErr w:type="gramStart"/>
       <w:r>
         <w:t>primaryKey</w:t>
       </w:r>
       <w:proofErr w:type="spellEnd"/>
+      <w:proofErr w:type="gramEnd"/>
       <w:r>
         <w:t xml:space="preserve"> is the id including the </w:t>
       </w:r>
@@ -1588,7 +1910,15 @@
       </w:r>
       <w:proofErr w:type="spellEnd"/>
       <w:r>
-        <w:t>. Values should be similar to the existing just small differences, and unit of measure should be the same. please consider the field separators "_". Create the File Equipment_Property_3.csv. create a python script for that.</w:t>
+        <w:t xml:space="preserve">. Values should be </w:t>
+      </w:r>
+      <w:proofErr w:type="gramStart"/>
+      <w:r>
+        <w:t>similar to</w:t>
+      </w:r>
+      <w:proofErr w:type="gramEnd"/>
+      <w:r>
+        <w:t xml:space="preserve"> the existing just small differences, and unit of measure should be the same. please consider the field separators "_". Create the File Equipment_Property_3.csv. create a python script for that.</w:t>
       </w:r>
     </w:p>
     <w:p/>
@@ -1645,10 +1975,12 @@
         <w:t xml:space="preserve"> is a combination of </w:t>
       </w:r>
       <w:proofErr w:type="spellStart"/>
+      <w:proofErr w:type="gramStart"/>
       <w:r>
         <w:t>ID,Value</w:t>
       </w:r>
       <w:proofErr w:type="spellEnd"/>
+      <w:proofErr w:type="gramEnd"/>
       <w:r>
         <w:t xml:space="preserve"> and </w:t>
       </w:r>
@@ -1666,7 +1998,15 @@
       </w:r>
       <w:proofErr w:type="spellEnd"/>
       <w:r>
-        <w:t xml:space="preserve"> numeric number of 6 digits, just consider it is not repeating. Duration you can take the values from example file and add +-1 or 2 units.  The description contains the word Downtime and it should generate the Operation </w:t>
+        <w:t xml:space="preserve"> numeric number of 6 digits, just consider it is not repeating. Duration you can take the values from example file and add +-1 or 2 units.  The description contains the word </w:t>
+      </w:r>
+      <w:proofErr w:type="gramStart"/>
+      <w:r>
+        <w:t>Downtime</w:t>
+      </w:r>
+      <w:proofErr w:type="gramEnd"/>
+      <w:r>
+        <w:t xml:space="preserve"> and it should generate the Operation </w:t>
       </w:r>
       <w:proofErr w:type="spellStart"/>
       <w:r>
@@ -1693,10 +2033,12 @@
         <w:t xml:space="preserve"> consists of the ID field. Id Field is the Id of related Operation </w:t>
       </w:r>
       <w:proofErr w:type="spellStart"/>
+      <w:proofErr w:type="gramStart"/>
       <w:r>
         <w:t>EventProperty</w:t>
       </w:r>
       <w:proofErr w:type="spellEnd"/>
+      <w:proofErr w:type="gramEnd"/>
       <w:r>
         <w:t xml:space="preserve"> and the related equipment Id used in the Operation Event Property. </w:t>
       </w:r>
@@ -1706,7 +2048,31 @@
       </w:r>
       <w:proofErr w:type="spellEnd"/>
       <w:r>
-        <w:t xml:space="preserve"> you can use similar to the sample data, maybe add 1 or 2 days on top. all other fields supposed to be similar to sample data. And create also the mapping file similar to the Operations </w:t>
+        <w:t xml:space="preserve"> you can use </w:t>
+      </w:r>
+      <w:proofErr w:type="gramStart"/>
+      <w:r>
+        <w:t>similar to</w:t>
+      </w:r>
+      <w:proofErr w:type="gramEnd"/>
+      <w:r>
+        <w:t xml:space="preserve"> the sample data, maybe add 1 or 2 days on top. all other fields supposed to be </w:t>
+      </w:r>
+      <w:proofErr w:type="gramStart"/>
+      <w:r>
+        <w:t>similar to</w:t>
+      </w:r>
+      <w:proofErr w:type="gramEnd"/>
+      <w:r>
+        <w:t xml:space="preserve"> sample data. And create also the mapping file </w:t>
+      </w:r>
+      <w:proofErr w:type="gramStart"/>
+      <w:r>
+        <w:t>similar to</w:t>
+      </w:r>
+      <w:proofErr w:type="gramEnd"/>
+      <w:r>
+        <w:t xml:space="preserve"> the Operations </w:t>
       </w:r>
       <w:proofErr w:type="spellStart"/>
       <w:r>
@@ -1734,7 +2100,15 @@
       </w:r>
       <w:proofErr w:type="spellEnd"/>
       <w:r>
-        <w:t xml:space="preserve"> to create data quality check script for equipment. I have Equipment related views. Each view has a primary Key. The Equipment view should be the base / start view. Equipment hast relations to other views which contains the Prefix "Equipment" in the name. that entities are connected with the Equipment via Views with the subfix "_mapping". The Equipment related views are also connected to each other via mapping files. create me queries for data </w:t>
+        <w:t xml:space="preserve"> to create data quality check script for equipment. I have Equipment related views. Each view has a primary Key. The Equipment view should be the base / start view. Equipment hast relations to other views which contains the Prefix "Equipment" in the name. that entities </w:t>
+      </w:r>
+      <w:proofErr w:type="gramStart"/>
+      <w:r>
+        <w:t>are connected with</w:t>
+      </w:r>
+      <w:proofErr w:type="gramEnd"/>
+      <w:r>
+        <w:t xml:space="preserve"> the Equipment via Views with the subfix "_mapping". The Equipment related views are also connected to each other via mapping files. create me queries for data </w:t>
       </w:r>
       <w:proofErr w:type="spellStart"/>
       <w:r>
@@ -2478,6 +2852,7 @@
   <w:style w:type="character" w:default="1" w:styleId="DefaultParagraphFont">
     <w:name w:val="Default Paragraph Font"/>
     <w:uiPriority w:val="1"/>
+    <w:semiHidden/>
     <w:unhideWhenUsed/>
   </w:style>
   <w:style w:type="table" w:default="1" w:styleId="TableNormal">

</xml_diff>

<commit_message>
updated quality checks, added segment data, equipment hierarchy
</commit_message>
<xml_diff>
--- a/Prompts.docx
+++ b/Prompts.docx
@@ -8,6 +8,80 @@
       </w:r>
     </w:p>
     <w:p>
+      <w:pPr>
+        <w:rPr>
+          <w:b/>
+          <w:bCs/>
+          <w:highlight w:val="yellow"/>
+        </w:rPr>
+      </w:pPr>
+      <w:r>
+        <w:rPr>
+          <w:b/>
+          <w:bCs/>
+          <w:highlight w:val="yellow"/>
+        </w:rPr>
+        <w:t>Segment Requirements start and end date.</w:t>
+      </w:r>
+    </w:p>
+    <w:p>
+      <w:proofErr w:type="gramStart"/>
+      <w:r>
+        <w:rPr>
+          <w:highlight w:val="yellow"/>
+        </w:rPr>
+        <w:t>the</w:t>
+      </w:r>
+      <w:proofErr w:type="gramEnd"/>
+      <w:r>
+        <w:rPr>
+          <w:highlight w:val="yellow"/>
+        </w:rPr>
+        <w:t xml:space="preserve"> start and end duration of the segment requirements should consider the </w:t>
+      </w:r>
+      <w:proofErr w:type="spellStart"/>
+      <w:r>
+        <w:rPr>
+          <w:highlight w:val="yellow"/>
+        </w:rPr>
+        <w:t>quipment</w:t>
+      </w:r>
+      <w:proofErr w:type="spellEnd"/>
+      <w:r>
+        <w:rPr>
+          <w:highlight w:val="yellow"/>
+        </w:rPr>
+        <w:t xml:space="preserve"> capacity, </w:t>
+      </w:r>
+      <w:proofErr w:type="gramStart"/>
+      <w:r>
+        <w:rPr>
+          <w:highlight w:val="yellow"/>
+        </w:rPr>
+        <w:t>similar to</w:t>
+      </w:r>
+      <w:proofErr w:type="gramEnd"/>
+      <w:r>
+        <w:rPr>
+          <w:highlight w:val="yellow"/>
+        </w:rPr>
+        <w:t xml:space="preserve"> what is done in segment </w:t>
+      </w:r>
+      <w:proofErr w:type="spellStart"/>
+      <w:proofErr w:type="gramStart"/>
+      <w:r>
+        <w:rPr>
+          <w:highlight w:val="yellow"/>
+        </w:rPr>
+        <w:t>response.a</w:t>
+      </w:r>
+      <w:proofErr w:type="spellEnd"/>
+      <w:proofErr w:type="gramEnd"/>
+    </w:p>
+    <w:p/>
+    <w:p/>
+    <w:p/>
+    <w:p>
       <w:r>
         <w:t>You are assisting in building a backend service called **ISA95 Test Data Generator**.</w:t>
       </w:r>
@@ -163,6 +237,7 @@
     <w:p/>
     <w:p>
       <w:r>
+        <w:lastRenderedPageBreak/>
         <w:t>### 1. Entity &amp; Graph Exploration</w:t>
       </w:r>
     </w:p>
@@ -193,111 +268,111 @@
     </w:p>
     <w:p>
       <w:r>
+        <w:t xml:space="preserve">  - User-selectable fields that can form a primary key (PK)</w:t>
+      </w:r>
+    </w:p>
+    <w:p>
+      <w:r>
+        <w:t>- Return related entities based on JSON-defined graph relationships</w:t>
+      </w:r>
+    </w:p>
+    <w:p/>
+    <w:p>
+      <w:r>
+        <w:t>### 2. Primary Key Rules</w:t>
+      </w:r>
+    </w:p>
+    <w:p>
+      <w:r>
+        <w:t>User must be able to:</w:t>
+      </w:r>
+    </w:p>
+    <w:p>
+      <w:r>
+        <w:t>- Define how primary keys are generated per entity</w:t>
+      </w:r>
+    </w:p>
+    <w:p>
+      <w:r>
+        <w:t>- Choose one or multiple fields to compose a composite primary key</w:t>
+      </w:r>
+    </w:p>
+    <w:p>
+      <w:r>
+        <w:t>- Apply formatting rules (e.g., prefix, concatenation pattern, zero-padding)</w:t>
+      </w:r>
+    </w:p>
+    <w:p/>
+    <w:p>
+      <w:r>
+        <w:t>Implement a `</w:t>
+      </w:r>
+      <w:proofErr w:type="spellStart"/>
+      <w:r>
+        <w:t>PrimaryKeyRule</w:t>
+      </w:r>
+      <w:proofErr w:type="spellEnd"/>
+      <w:r>
+        <w:t>` model that supports:</w:t>
+      </w:r>
+    </w:p>
+    <w:p>
+      <w:r>
+        <w:t>- Single-field PK</w:t>
+      </w:r>
+    </w:p>
+    <w:p>
+      <w:r>
+        <w:t>- Multi-field composite PK</w:t>
+      </w:r>
+    </w:p>
+    <w:p>
+      <w:r>
+        <w:t>- Custom formatting expressions</w:t>
+      </w:r>
+    </w:p>
+    <w:p/>
+    <w:p>
+      <w:r>
+        <w:t>### 3. Field Value Rules (User-Defined)</w:t>
+      </w:r>
+    </w:p>
+    <w:p>
+      <w:r>
+        <w:t>The system must allow rule configuration for fields such as:</w:t>
+      </w:r>
+    </w:p>
+    <w:p>
+      <w:r>
+        <w:t>- Value ranges (numbers, dates)</w:t>
+      </w:r>
+    </w:p>
+    <w:p>
+      <w:r>
+        <w:t>- Example value lists</w:t>
+      </w:r>
+    </w:p>
+    <w:p>
+      <w:r>
+        <w:t>- Regex patterns</w:t>
+      </w:r>
+    </w:p>
+    <w:p>
+      <w:r>
+        <w:t xml:space="preserve">- Fixed </w:t>
+      </w:r>
+      <w:proofErr w:type="gramStart"/>
+      <w:r>
+        <w:t>lookup</w:t>
+      </w:r>
+      <w:proofErr w:type="gramEnd"/>
+      <w:r>
+        <w:t xml:space="preserve"> values</w:t>
+      </w:r>
+    </w:p>
+    <w:p>
+      <w:r>
         <w:lastRenderedPageBreak/>
-        <w:t xml:space="preserve">  - User-selectable fields that can form a primary key (PK)</w:t>
-      </w:r>
-    </w:p>
-    <w:p>
-      <w:r>
-        <w:t>- Return related entities based on JSON-defined graph relationships</w:t>
-      </w:r>
-    </w:p>
-    <w:p/>
-    <w:p>
-      <w:r>
-        <w:t>### 2. Primary Key Rules</w:t>
-      </w:r>
-    </w:p>
-    <w:p>
-      <w:r>
-        <w:t>User must be able to:</w:t>
-      </w:r>
-    </w:p>
-    <w:p>
-      <w:r>
-        <w:t>- Define how primary keys are generated per entity</w:t>
-      </w:r>
-    </w:p>
-    <w:p>
-      <w:r>
-        <w:t>- Choose one or multiple fields to compose a composite primary key</w:t>
-      </w:r>
-    </w:p>
-    <w:p>
-      <w:r>
-        <w:t>- Apply formatting rules (e.g., prefix, concatenation pattern, zero-padding)</w:t>
-      </w:r>
-    </w:p>
-    <w:p/>
-    <w:p>
-      <w:r>
-        <w:t>Implement a `</w:t>
-      </w:r>
-      <w:proofErr w:type="spellStart"/>
-      <w:r>
-        <w:t>PrimaryKeyRule</w:t>
-      </w:r>
-      <w:proofErr w:type="spellEnd"/>
-      <w:r>
-        <w:t>` model that supports:</w:t>
-      </w:r>
-    </w:p>
-    <w:p>
-      <w:r>
-        <w:t>- Single-field PK</w:t>
-      </w:r>
-    </w:p>
-    <w:p>
-      <w:r>
-        <w:t>- Multi-field composite PK</w:t>
-      </w:r>
-    </w:p>
-    <w:p>
-      <w:r>
-        <w:t>- Custom formatting expressions</w:t>
-      </w:r>
-    </w:p>
-    <w:p/>
-    <w:p>
-      <w:r>
-        <w:t>### 3. Field Value Rules (User-Defined)</w:t>
-      </w:r>
-    </w:p>
-    <w:p>
-      <w:r>
-        <w:t>The system must allow rule configuration for fields such as:</w:t>
-      </w:r>
-    </w:p>
-    <w:p>
-      <w:r>
-        <w:t>- Value ranges (numbers, dates)</w:t>
-      </w:r>
-    </w:p>
-    <w:p>
-      <w:r>
-        <w:t>- Example value lists</w:t>
-      </w:r>
-    </w:p>
-    <w:p>
-      <w:r>
-        <w:t>- Regex patterns</w:t>
-      </w:r>
-    </w:p>
-    <w:p>
-      <w:r>
-        <w:t xml:space="preserve">- Fixed </w:t>
-      </w:r>
-      <w:proofErr w:type="gramStart"/>
-      <w:r>
-        <w:t>lookup</w:t>
-      </w:r>
-      <w:proofErr w:type="gramEnd"/>
-      <w:r>
-        <w:t xml:space="preserve"> values</w:t>
-      </w:r>
-    </w:p>
-    <w:p>
-      <w:r>
         <w:t>- Generators (e.g., sequential numbers)</w:t>
       </w:r>
     </w:p>
@@ -335,7 +410,6 @@
     <w:p>
       <w:proofErr w:type="spellStart"/>
       <w:r>
-        <w:lastRenderedPageBreak/>
         <w:t>RuleType</w:t>
       </w:r>
       <w:proofErr w:type="spellEnd"/>
@@ -443,55 +517,6 @@
         <w:t>SourcePrimaryKey</w:t>
       </w:r>
       <w:proofErr w:type="spellEnd"/>
-    </w:p>
-    <w:p>
-      <w:r>
-        <w:t xml:space="preserve">- </w:t>
-      </w:r>
-      <w:proofErr w:type="spellStart"/>
-      <w:r>
-        <w:t>TargetType</w:t>
-      </w:r>
-      <w:proofErr w:type="spellEnd"/>
-    </w:p>
-    <w:p>
-      <w:r>
-        <w:t xml:space="preserve">- </w:t>
-      </w:r>
-      <w:proofErr w:type="spellStart"/>
-      <w:r>
-        <w:t>TargetPrimaryKey</w:t>
-      </w:r>
-      <w:proofErr w:type="spellEnd"/>
-    </w:p>
-    <w:p>
-      <w:r>
-        <w:t xml:space="preserve">- </w:t>
-      </w:r>
-      <w:proofErr w:type="spellStart"/>
-      <w:r>
-        <w:t>RelationshipType</w:t>
-      </w:r>
-      <w:proofErr w:type="spellEnd"/>
-    </w:p>
-    <w:p/>
-    <w:p>
-      <w:r>
-        <w:t>Rules:</w:t>
-      </w:r>
-    </w:p>
-    <w:p>
-      <w:r>
-        <w:t xml:space="preserve">- </w:t>
-      </w:r>
-      <w:proofErr w:type="spellStart"/>
-      <w:r>
-        <w:t>SourceType</w:t>
-      </w:r>
-      <w:proofErr w:type="spellEnd"/>
-      <w:r>
-        <w:t xml:space="preserve"> = the main selected entity</w:t>
-      </w:r>
     </w:p>
     <w:p>
       <w:r>
@@ -503,6 +528,55 @@
         <w:t>TargetType</w:t>
       </w:r>
       <w:proofErr w:type="spellEnd"/>
+    </w:p>
+    <w:p>
+      <w:r>
+        <w:t xml:space="preserve">- </w:t>
+      </w:r>
+      <w:proofErr w:type="spellStart"/>
+      <w:r>
+        <w:t>TargetPrimaryKey</w:t>
+      </w:r>
+      <w:proofErr w:type="spellEnd"/>
+    </w:p>
+    <w:p>
+      <w:r>
+        <w:t xml:space="preserve">- </w:t>
+      </w:r>
+      <w:proofErr w:type="spellStart"/>
+      <w:r>
+        <w:t>RelationshipType</w:t>
+      </w:r>
+      <w:proofErr w:type="spellEnd"/>
+    </w:p>
+    <w:p/>
+    <w:p>
+      <w:r>
+        <w:t>Rules:</w:t>
+      </w:r>
+    </w:p>
+    <w:p>
+      <w:r>
+        <w:t xml:space="preserve">- </w:t>
+      </w:r>
+      <w:proofErr w:type="spellStart"/>
+      <w:r>
+        <w:t>SourceType</w:t>
+      </w:r>
+      <w:proofErr w:type="spellEnd"/>
+      <w:r>
+        <w:t xml:space="preserve"> = the main selected entity</w:t>
+      </w:r>
+    </w:p>
+    <w:p>
+      <w:r>
+        <w:t xml:space="preserve">- </w:t>
+      </w:r>
+      <w:proofErr w:type="spellStart"/>
+      <w:r>
+        <w:t>TargetType</w:t>
+      </w:r>
+      <w:proofErr w:type="spellEnd"/>
       <w:r>
         <w:t xml:space="preserve"> = any related entity selected for inclusion</w:t>
       </w:r>
@@ -657,6 +731,7 @@
     </w:p>
     <w:p>
       <w:r>
+        <w:lastRenderedPageBreak/>
         <w:t xml:space="preserve">  - </w:t>
       </w:r>
       <w:proofErr w:type="spellStart"/>
@@ -717,7 +792,6 @@
     </w:p>
     <w:p>
       <w:r>
-        <w:lastRenderedPageBreak/>
         <w:t>- Use strongly typed models for entities, attributes, rules, relationships</w:t>
       </w:r>
     </w:p>
@@ -841,6 +915,7 @@
         <w:ind w:left="720"/>
       </w:pPr>
       <w:r>
+        <w:lastRenderedPageBreak/>
         <w:t>- Choose composite keys</w:t>
       </w:r>
     </w:p>
@@ -881,7 +956,6 @@
     </w:p>
     <w:p>
       <w:r>
-        <w:lastRenderedPageBreak/>
         <w:t>- Range (with numeric/datetime pickers)</w:t>
       </w:r>
     </w:p>
@@ -1000,7 +1074,6 @@
     </w:p>
     <w:p>
       <w:r>
-        <w:lastRenderedPageBreak/>
         <w:t xml:space="preserve">- Preview table showing </w:t>
       </w:r>
       <w:proofErr w:type="spellStart"/>
@@ -1134,6 +1207,7 @@
     </w:p>
     <w:p>
       <w:r>
+        <w:lastRenderedPageBreak/>
         <w:t xml:space="preserve">   - Maintain incremental counters if required</w:t>
       </w:r>
     </w:p>
@@ -1172,7 +1246,6 @@
     </w:p>
     <w:p>
       <w:r>
-        <w:lastRenderedPageBreak/>
         <w:t>6. Avoid infinite recursion using visited set</w:t>
       </w:r>
     </w:p>
@@ -1310,6 +1383,7 @@
     </w:p>
     <w:p>
       <w:r>
+        <w:lastRenderedPageBreak/>
         <w:t>- Page layout + routing</w:t>
       </w:r>
     </w:p>
@@ -1340,7 +1414,6 @@
     </w:p>
     <w:p>
       <w:r>
-        <w:lastRenderedPageBreak/>
         <w:t>- Graph visualization components</w:t>
       </w:r>
     </w:p>
@@ -1614,7 +1687,11 @@
       </w:r>
       <w:r>
         <w:tab/>
-        <w:t xml:space="preserve">Relationship Type. The Source Primary key is the </w:t>
+        <w:t xml:space="preserve">Relationship Type. The </w:t>
+      </w:r>
+      <w:r>
+        <w:lastRenderedPageBreak/>
+        <w:t xml:space="preserve">Source Primary key is the </w:t>
       </w:r>
       <w:proofErr w:type="spellStart"/>
       <w:proofErr w:type="gramStart"/>
@@ -1722,11 +1799,7 @@
       </w:r>
       <w:proofErr w:type="spellEnd"/>
       <w:r>
-        <w:t xml:space="preserve"> type should be not the cardinality, but the name </w:t>
-      </w:r>
-      <w:r>
-        <w:lastRenderedPageBreak/>
-        <w:t xml:space="preserve">of the relationship, name not the Display name. </w:t>
+        <w:t xml:space="preserve"> type should be not the cardinality, but the name of the relationship, name not the Display name. </w:t>
       </w:r>
       <w:proofErr w:type="gramStart"/>
       <w:r>
@@ -2022,7 +2095,11 @@
       </w:r>
       <w:proofErr w:type="spellEnd"/>
       <w:r>
-        <w:t xml:space="preserve">: BREADBLAST10, BREADBLAST11, BREADBLAST12, BREADBLAST20, BREADBLAST21. Entity Operations Event the </w:t>
+        <w:t xml:space="preserve">: BREADBLAST10, BREADBLAST11, BREADBLAST12, BREADBLAST20, BREADBLAST21. Entity Operations </w:t>
+      </w:r>
+      <w:r>
+        <w:lastRenderedPageBreak/>
+        <w:t xml:space="preserve">Event the </w:t>
       </w:r>
       <w:proofErr w:type="spellStart"/>
       <w:r>

</xml_diff>

<commit_message>
added to master data operations response, operations evend record and entry. endjusted entity browser
</commit_message>
<xml_diff>
--- a/Prompts.docx
+++ b/Prompts.docx
@@ -83,6 +83,43 @@
     <w:p/>
     <w:p>
       <w:r>
+        <w:rPr>
+          <w:highlight w:val="darkCyan"/>
+        </w:rPr>
+        <w:t xml:space="preserve">help me to generate quality check views. I want to generate for each view with subfix "_mapping" a referential integrity check. The mapping view is separated into two views by "_to_" the </w:t>
+      </w:r>
+      <w:proofErr w:type="spellStart"/>
+      <w:r>
+        <w:rPr>
+          <w:highlight w:val="darkCyan"/>
+        </w:rPr>
+        <w:t>PrimaryKey</w:t>
+      </w:r>
+      <w:proofErr w:type="spellEnd"/>
+      <w:r>
+        <w:rPr>
+          <w:highlight w:val="darkCyan"/>
+        </w:rPr>
+        <w:t xml:space="preserve"> of the first view is related to the Source Primary Key and the Target Primary Key is related to the Primary Key of the second view. </w:t>
+      </w:r>
+      <w:proofErr w:type="gramStart"/>
+      <w:r>
+        <w:rPr>
+          <w:highlight w:val="darkCyan"/>
+        </w:rPr>
+        <w:t>this</w:t>
+      </w:r>
+      <w:proofErr w:type="gramEnd"/>
+      <w:r>
+        <w:rPr>
+          <w:highlight w:val="darkCyan"/>
+        </w:rPr>
+        <w:t xml:space="preserve"> is how you can join the entities.</w:t>
+      </w:r>
+    </w:p>
+    <w:p/>
+    <w:p>
+      <w:r>
         <w:t>You are assisting in building a backend service called **ISA95 Test Data Generator**.</w:t>
       </w:r>
     </w:p>
@@ -237,108 +274,108 @@
     <w:p/>
     <w:p>
       <w:r>
+        <w:t>### 1. Entity &amp; Graph Exploration</w:t>
+      </w:r>
+    </w:p>
+    <w:p>
+      <w:r>
+        <w:t>Implement API endpoints that:</w:t>
+      </w:r>
+    </w:p>
+    <w:p>
+      <w:r>
+        <w:t>- Return a list of all available entities</w:t>
+      </w:r>
+    </w:p>
+    <w:p>
+      <w:r>
+        <w:t>- Return the structure of a selected entity:</w:t>
+      </w:r>
+    </w:p>
+    <w:p>
+      <w:r>
+        <w:t xml:space="preserve">  - Fields and their data types</w:t>
+      </w:r>
+    </w:p>
+    <w:p>
+      <w:r>
+        <w:t xml:space="preserve">  - Constraints</w:t>
+      </w:r>
+    </w:p>
+    <w:p>
+      <w:r>
+        <w:t xml:space="preserve">  - User-selectable fields that can form a primary key (PK)</w:t>
+      </w:r>
+    </w:p>
+    <w:p>
+      <w:r>
+        <w:t>- Return related entities based on JSON-defined graph relationships</w:t>
+      </w:r>
+    </w:p>
+    <w:p/>
+    <w:p>
+      <w:r>
+        <w:t>### 2. Primary Key Rules</w:t>
+      </w:r>
+    </w:p>
+    <w:p>
+      <w:r>
+        <w:t>User must be able to:</w:t>
+      </w:r>
+    </w:p>
+    <w:p>
+      <w:r>
+        <w:t>- Define how primary keys are generated per entity</w:t>
+      </w:r>
+    </w:p>
+    <w:p>
+      <w:r>
+        <w:t>- Choose one or multiple fields to compose a composite primary key</w:t>
+      </w:r>
+    </w:p>
+    <w:p>
+      <w:r>
+        <w:t>- Apply formatting rules (e.g., prefix, concatenation pattern, zero-padding)</w:t>
+      </w:r>
+    </w:p>
+    <w:p/>
+    <w:p>
+      <w:r>
+        <w:t>Implement a `</w:t>
+      </w:r>
+      <w:proofErr w:type="spellStart"/>
+      <w:r>
+        <w:t>PrimaryKeyRule</w:t>
+      </w:r>
+      <w:proofErr w:type="spellEnd"/>
+      <w:r>
+        <w:t>` model that supports:</w:t>
+      </w:r>
+    </w:p>
+    <w:p>
+      <w:r>
+        <w:t>- Single-field PK</w:t>
+      </w:r>
+    </w:p>
+    <w:p>
+      <w:r>
+        <w:t>- Multi-field composite PK</w:t>
+      </w:r>
+    </w:p>
+    <w:p>
+      <w:r>
+        <w:t>- Custom formatting expressions</w:t>
+      </w:r>
+    </w:p>
+    <w:p/>
+    <w:p>
+      <w:r>
+        <w:t>### 3. Field Value Rules (User-Defined)</w:t>
+      </w:r>
+    </w:p>
+    <w:p>
+      <w:r>
         <w:lastRenderedPageBreak/>
-        <w:t>### 1. Entity &amp; Graph Exploration</w:t>
-      </w:r>
-    </w:p>
-    <w:p>
-      <w:r>
-        <w:t>Implement API endpoints that:</w:t>
-      </w:r>
-    </w:p>
-    <w:p>
-      <w:r>
-        <w:t>- Return a list of all available entities</w:t>
-      </w:r>
-    </w:p>
-    <w:p>
-      <w:r>
-        <w:t>- Return the structure of a selected entity:</w:t>
-      </w:r>
-    </w:p>
-    <w:p>
-      <w:r>
-        <w:t xml:space="preserve">  - Fields and their data types</w:t>
-      </w:r>
-    </w:p>
-    <w:p>
-      <w:r>
-        <w:t xml:space="preserve">  - Constraints</w:t>
-      </w:r>
-    </w:p>
-    <w:p>
-      <w:r>
-        <w:t xml:space="preserve">  - User-selectable fields that can form a primary key (PK)</w:t>
-      </w:r>
-    </w:p>
-    <w:p>
-      <w:r>
-        <w:t>- Return related entities based on JSON-defined graph relationships</w:t>
-      </w:r>
-    </w:p>
-    <w:p/>
-    <w:p>
-      <w:r>
-        <w:t>### 2. Primary Key Rules</w:t>
-      </w:r>
-    </w:p>
-    <w:p>
-      <w:r>
-        <w:t>User must be able to:</w:t>
-      </w:r>
-    </w:p>
-    <w:p>
-      <w:r>
-        <w:t>- Define how primary keys are generated per entity</w:t>
-      </w:r>
-    </w:p>
-    <w:p>
-      <w:r>
-        <w:t>- Choose one or multiple fields to compose a composite primary key</w:t>
-      </w:r>
-    </w:p>
-    <w:p>
-      <w:r>
-        <w:t>- Apply formatting rules (e.g., prefix, concatenation pattern, zero-padding)</w:t>
-      </w:r>
-    </w:p>
-    <w:p/>
-    <w:p>
-      <w:r>
-        <w:t>Implement a `</w:t>
-      </w:r>
-      <w:proofErr w:type="spellStart"/>
-      <w:r>
-        <w:t>PrimaryKeyRule</w:t>
-      </w:r>
-      <w:proofErr w:type="spellEnd"/>
-      <w:r>
-        <w:t>` model that supports:</w:t>
-      </w:r>
-    </w:p>
-    <w:p>
-      <w:r>
-        <w:t>- Single-field PK</w:t>
-      </w:r>
-    </w:p>
-    <w:p>
-      <w:r>
-        <w:t>- Multi-field composite PK</w:t>
-      </w:r>
-    </w:p>
-    <w:p>
-      <w:r>
-        <w:t>- Custom formatting expressions</w:t>
-      </w:r>
-    </w:p>
-    <w:p/>
-    <w:p>
-      <w:r>
-        <w:t>### 3. Field Value Rules (User-Defined)</w:t>
-      </w:r>
-    </w:p>
-    <w:p>
-      <w:r>
         <w:t>The system must allow rule configuration for fields such as:</w:t>
       </w:r>
     </w:p>
@@ -372,344 +409,343 @@
     </w:p>
     <w:p>
       <w:r>
+        <w:t>- Generators (e.g., sequential numbers)</w:t>
+      </w:r>
+    </w:p>
+    <w:p>
+      <w:r>
+        <w:t>- Deterministic seeding</w:t>
+      </w:r>
+    </w:p>
+    <w:p/>
+    <w:p>
+      <w:r>
+        <w:t>Implement a flexible rule model:</w:t>
+      </w:r>
+    </w:p>
+    <w:p>
+      <w:proofErr w:type="spellStart"/>
+      <w:r>
+        <w:t>FieldRule</w:t>
+      </w:r>
+      <w:proofErr w:type="spellEnd"/>
+      <w:r>
+        <w:t xml:space="preserve"> {</w:t>
+      </w:r>
+    </w:p>
+    <w:p>
+      <w:proofErr w:type="spellStart"/>
+      <w:r>
+        <w:t>FieldName</w:t>
+      </w:r>
+      <w:proofErr w:type="spellEnd"/>
+      <w:r>
+        <w:t>: string</w:t>
+      </w:r>
+    </w:p>
+    <w:p>
+      <w:proofErr w:type="spellStart"/>
+      <w:r>
+        <w:t>RuleType</w:t>
+      </w:r>
+      <w:proofErr w:type="spellEnd"/>
+      <w:r>
+        <w:t>: Range | Examples | Pattern | Static | Sequence</w:t>
+      </w:r>
+    </w:p>
+    <w:p>
+      <w:r>
+        <w:t>Parameters: object</w:t>
+      </w:r>
+    </w:p>
+    <w:p>
+      <w:r>
+        <w:t>}</w:t>
+      </w:r>
+    </w:p>
+    <w:p/>
+    <w:p>
+      <w:r>
+        <w:t>markdown</w:t>
+      </w:r>
+    </w:p>
+    <w:p>
+      <w:r>
+        <w:t>Copy code</w:t>
+      </w:r>
+    </w:p>
+    <w:p/>
+    <w:p>
+      <w:r>
+        <w:t>### 4. Dummy Data Generation</w:t>
+      </w:r>
+    </w:p>
+    <w:p>
+      <w:r>
+        <w:t>The backend must:</w:t>
+      </w:r>
+    </w:p>
+    <w:p>
+      <w:r>
+        <w:t>- Generate consistent, repeatable test data</w:t>
+      </w:r>
+    </w:p>
+    <w:p>
+      <w:r>
+        <w:t>- Expand entities recursively into related entities</w:t>
+      </w:r>
+    </w:p>
+    <w:p>
+      <w:r>
+        <w:t xml:space="preserve">- Maintain referential integrity using </w:t>
+      </w:r>
+      <w:proofErr w:type="gramStart"/>
+      <w:r>
+        <w:t>the defined</w:t>
+      </w:r>
+      <w:proofErr w:type="gramEnd"/>
+      <w:r>
+        <w:t xml:space="preserve"> relationships</w:t>
+      </w:r>
+    </w:p>
+    <w:p>
+      <w:r>
+        <w:t>- Use deterministic seeding always</w:t>
+      </w:r>
+    </w:p>
+    <w:p>
+      <w:r>
+        <w:t>- Avoid infinite recursion in cyclic graphs</w:t>
+      </w:r>
+    </w:p>
+    <w:p>
+      <w:r>
+        <w:t>- Cache generated instances for reuse</w:t>
+      </w:r>
+    </w:p>
+    <w:p/>
+    <w:p>
+      <w:r>
+        <w:t>### 5. Mapping File Generation</w:t>
+      </w:r>
+    </w:p>
+    <w:p>
+      <w:r>
+        <w:t>Mapping file schema:</w:t>
+      </w:r>
+    </w:p>
+    <w:p>
+      <w:r>
+        <w:t xml:space="preserve">- </w:t>
+      </w:r>
+      <w:proofErr w:type="spellStart"/>
+      <w:r>
+        <w:t>SourceType</w:t>
+      </w:r>
+      <w:proofErr w:type="spellEnd"/>
+    </w:p>
+    <w:p>
+      <w:r>
+        <w:t xml:space="preserve">- </w:t>
+      </w:r>
+      <w:proofErr w:type="spellStart"/>
+      <w:r>
+        <w:t>SourcePrimaryKey</w:t>
+      </w:r>
+      <w:proofErr w:type="spellEnd"/>
+    </w:p>
+    <w:p>
+      <w:r>
+        <w:t xml:space="preserve">- </w:t>
+      </w:r>
+      <w:proofErr w:type="spellStart"/>
+      <w:r>
+        <w:t>TargetType</w:t>
+      </w:r>
+      <w:proofErr w:type="spellEnd"/>
+    </w:p>
+    <w:p>
+      <w:r>
+        <w:t xml:space="preserve">- </w:t>
+      </w:r>
+      <w:proofErr w:type="spellStart"/>
+      <w:r>
+        <w:t>TargetPrimaryKey</w:t>
+      </w:r>
+      <w:proofErr w:type="spellEnd"/>
+    </w:p>
+    <w:p>
+      <w:r>
+        <w:t xml:space="preserve">- </w:t>
+      </w:r>
+      <w:proofErr w:type="spellStart"/>
+      <w:r>
+        <w:t>RelationshipType</w:t>
+      </w:r>
+      <w:proofErr w:type="spellEnd"/>
+    </w:p>
+    <w:p/>
+    <w:p>
+      <w:r>
+        <w:t>Rules:</w:t>
+      </w:r>
+    </w:p>
+    <w:p>
+      <w:r>
+        <w:t xml:space="preserve">- </w:t>
+      </w:r>
+      <w:proofErr w:type="spellStart"/>
+      <w:r>
+        <w:t>SourceType</w:t>
+      </w:r>
+      <w:proofErr w:type="spellEnd"/>
+      <w:r>
+        <w:t xml:space="preserve"> = the main selected entity</w:t>
+      </w:r>
+    </w:p>
+    <w:p>
+      <w:r>
+        <w:t xml:space="preserve">- </w:t>
+      </w:r>
+      <w:proofErr w:type="spellStart"/>
+      <w:r>
+        <w:t>TargetType</w:t>
+      </w:r>
+      <w:proofErr w:type="spellEnd"/>
+      <w:r>
+        <w:t xml:space="preserve"> = any related entity selected for inclusion</w:t>
+      </w:r>
+    </w:p>
+    <w:p>
+      <w:r>
+        <w:t>-</w:t>
+      </w:r>
+      <w:r>
+        <w:t xml:space="preserve"> Source</w:t>
+      </w:r>
+      <w:r>
+        <w:t xml:space="preserve"> Primary keys </w:t>
+      </w:r>
+      <w:proofErr w:type="gramStart"/>
+      <w:r>
+        <w:t>is</w:t>
+      </w:r>
+      <w:proofErr w:type="gramEnd"/>
+      <w:r>
+        <w:t xml:space="preserve"> the</w:t>
+      </w:r>
+      <w:r>
+        <w:t xml:space="preserve"> PK </w:t>
+      </w:r>
+      <w:r>
+        <w:t>of the Source entity</w:t>
+      </w:r>
+    </w:p>
+    <w:p>
+      <w:r>
+        <w:t xml:space="preserve">- Target Primary key is the PK of the Related </w:t>
+      </w:r>
+      <w:proofErr w:type="spellStart"/>
+      <w:r>
+        <w:t>entitiy</w:t>
+      </w:r>
+      <w:proofErr w:type="spellEnd"/>
+    </w:p>
+    <w:p>
+      <w:r>
+        <w:t xml:space="preserve">- </w:t>
+      </w:r>
+      <w:proofErr w:type="spellStart"/>
+      <w:r>
+        <w:t>RelationshipType</w:t>
+      </w:r>
+      <w:proofErr w:type="spellEnd"/>
+      <w:r>
+        <w:t xml:space="preserve"> must match metadata from JSON</w:t>
+      </w:r>
+    </w:p>
+    <w:p/>
+    <w:p>
+      <w:r>
+        <w:t>Implement endpoint:</w:t>
+      </w:r>
+    </w:p>
+    <w:p>
+      <w:r>
+        <w:t>`POST /generate-mapping` → returns JSON mapping file</w:t>
+      </w:r>
+    </w:p>
+    <w:p/>
+    <w:p>
+      <w:r>
+        <w:t>### 6. API Endpoints needed</w:t>
+      </w:r>
+    </w:p>
+    <w:p>
+      <w:r>
+        <w:t>- GET /entities</w:t>
+      </w:r>
+    </w:p>
+    <w:p>
+      <w:r>
+        <w:t>- GET /</w:t>
+      </w:r>
+      <w:proofErr w:type="gramStart"/>
+      <w:r>
+        <w:t>entities/{</w:t>
+      </w:r>
+      <w:proofErr w:type="spellStart"/>
+      <w:r>
+        <w:t>entityName</w:t>
+      </w:r>
+      <w:proofErr w:type="spellEnd"/>
+      <w:r>
+        <w:t>}/</w:t>
+      </w:r>
+      <w:proofErr w:type="gramEnd"/>
+      <w:r>
+        <w:t>structure</w:t>
+      </w:r>
+    </w:p>
+    <w:p>
+      <w:r>
+        <w:t>- GET /</w:t>
+      </w:r>
+      <w:proofErr w:type="gramStart"/>
+      <w:r>
+        <w:t>entities/{</w:t>
+      </w:r>
+      <w:proofErr w:type="spellStart"/>
+      <w:r>
+        <w:t>entityName</w:t>
+      </w:r>
+      <w:proofErr w:type="spellEnd"/>
+      <w:r>
+        <w:t>}/</w:t>
+      </w:r>
+      <w:proofErr w:type="gramEnd"/>
+      <w:r>
+        <w:t>related</w:t>
+      </w:r>
+    </w:p>
+    <w:p>
+      <w:r>
+        <w:t>- POST /generate-data</w:t>
+      </w:r>
+    </w:p>
+    <w:p>
+      <w:r>
+        <w:t>- POST /generate-mapping</w:t>
+      </w:r>
+    </w:p>
+    <w:p>
+      <w:r>
+        <w:t>- POST /define-pk-rules</w:t>
+      </w:r>
+    </w:p>
+    <w:p>
+      <w:r>
         <w:lastRenderedPageBreak/>
-        <w:t>- Generators (e.g., sequential numbers)</w:t>
-      </w:r>
-    </w:p>
-    <w:p>
-      <w:r>
-        <w:t>- Deterministic seeding</w:t>
-      </w:r>
-    </w:p>
-    <w:p/>
-    <w:p>
-      <w:r>
-        <w:t>Implement a flexible rule model:</w:t>
-      </w:r>
-    </w:p>
-    <w:p>
-      <w:proofErr w:type="spellStart"/>
-      <w:r>
-        <w:t>FieldRule</w:t>
-      </w:r>
-      <w:proofErr w:type="spellEnd"/>
-      <w:r>
-        <w:t xml:space="preserve"> {</w:t>
-      </w:r>
-    </w:p>
-    <w:p>
-      <w:proofErr w:type="spellStart"/>
-      <w:r>
-        <w:t>FieldName</w:t>
-      </w:r>
-      <w:proofErr w:type="spellEnd"/>
-      <w:r>
-        <w:t>: string</w:t>
-      </w:r>
-    </w:p>
-    <w:p>
-      <w:proofErr w:type="spellStart"/>
-      <w:r>
-        <w:t>RuleType</w:t>
-      </w:r>
-      <w:proofErr w:type="spellEnd"/>
-      <w:r>
-        <w:t>: Range | Examples | Pattern | Static | Sequence</w:t>
-      </w:r>
-    </w:p>
-    <w:p>
-      <w:r>
-        <w:t>Parameters: object</w:t>
-      </w:r>
-    </w:p>
-    <w:p>
-      <w:r>
-        <w:t>}</w:t>
-      </w:r>
-    </w:p>
-    <w:p/>
-    <w:p>
-      <w:r>
-        <w:t>markdown</w:t>
-      </w:r>
-    </w:p>
-    <w:p>
-      <w:r>
-        <w:t>Copy code</w:t>
-      </w:r>
-    </w:p>
-    <w:p/>
-    <w:p>
-      <w:r>
-        <w:t>### 4. Dummy Data Generation</w:t>
-      </w:r>
-    </w:p>
-    <w:p>
-      <w:r>
-        <w:t>The backend must:</w:t>
-      </w:r>
-    </w:p>
-    <w:p>
-      <w:r>
-        <w:t>- Generate consistent, repeatable test data</w:t>
-      </w:r>
-    </w:p>
-    <w:p>
-      <w:r>
-        <w:t>- Expand entities recursively into related entities</w:t>
-      </w:r>
-    </w:p>
-    <w:p>
-      <w:r>
-        <w:t xml:space="preserve">- Maintain referential integrity using </w:t>
-      </w:r>
-      <w:proofErr w:type="gramStart"/>
-      <w:r>
-        <w:t>the defined</w:t>
-      </w:r>
-      <w:proofErr w:type="gramEnd"/>
-      <w:r>
-        <w:t xml:space="preserve"> relationships</w:t>
-      </w:r>
-    </w:p>
-    <w:p>
-      <w:r>
-        <w:t>- Use deterministic seeding always</w:t>
-      </w:r>
-    </w:p>
-    <w:p>
-      <w:r>
-        <w:t>- Avoid infinite recursion in cyclic graphs</w:t>
-      </w:r>
-    </w:p>
-    <w:p>
-      <w:r>
-        <w:t>- Cache generated instances for reuse</w:t>
-      </w:r>
-    </w:p>
-    <w:p/>
-    <w:p>
-      <w:r>
-        <w:t>### 5. Mapping File Generation</w:t>
-      </w:r>
-    </w:p>
-    <w:p>
-      <w:r>
-        <w:t>Mapping file schema:</w:t>
-      </w:r>
-    </w:p>
-    <w:p>
-      <w:r>
-        <w:t xml:space="preserve">- </w:t>
-      </w:r>
-      <w:proofErr w:type="spellStart"/>
-      <w:r>
-        <w:t>SourceType</w:t>
-      </w:r>
-      <w:proofErr w:type="spellEnd"/>
-    </w:p>
-    <w:p>
-      <w:r>
-        <w:t xml:space="preserve">- </w:t>
-      </w:r>
-      <w:proofErr w:type="spellStart"/>
-      <w:r>
-        <w:t>SourcePrimaryKey</w:t>
-      </w:r>
-      <w:proofErr w:type="spellEnd"/>
-    </w:p>
-    <w:p>
-      <w:r>
-        <w:lastRenderedPageBreak/>
-        <w:t xml:space="preserve">- </w:t>
-      </w:r>
-      <w:proofErr w:type="spellStart"/>
-      <w:r>
-        <w:t>TargetType</w:t>
-      </w:r>
-      <w:proofErr w:type="spellEnd"/>
-    </w:p>
-    <w:p>
-      <w:r>
-        <w:t xml:space="preserve">- </w:t>
-      </w:r>
-      <w:proofErr w:type="spellStart"/>
-      <w:r>
-        <w:t>TargetPrimaryKey</w:t>
-      </w:r>
-      <w:proofErr w:type="spellEnd"/>
-    </w:p>
-    <w:p>
-      <w:r>
-        <w:t xml:space="preserve">- </w:t>
-      </w:r>
-      <w:proofErr w:type="spellStart"/>
-      <w:r>
-        <w:t>RelationshipType</w:t>
-      </w:r>
-      <w:proofErr w:type="spellEnd"/>
-    </w:p>
-    <w:p/>
-    <w:p>
-      <w:r>
-        <w:t>Rules:</w:t>
-      </w:r>
-    </w:p>
-    <w:p>
-      <w:r>
-        <w:t xml:space="preserve">- </w:t>
-      </w:r>
-      <w:proofErr w:type="spellStart"/>
-      <w:r>
-        <w:t>SourceType</w:t>
-      </w:r>
-      <w:proofErr w:type="spellEnd"/>
-      <w:r>
-        <w:t xml:space="preserve"> = the main selected entity</w:t>
-      </w:r>
-    </w:p>
-    <w:p>
-      <w:r>
-        <w:t xml:space="preserve">- </w:t>
-      </w:r>
-      <w:proofErr w:type="spellStart"/>
-      <w:r>
-        <w:t>TargetType</w:t>
-      </w:r>
-      <w:proofErr w:type="spellEnd"/>
-      <w:r>
-        <w:t xml:space="preserve"> = any related entity selected for inclusion</w:t>
-      </w:r>
-    </w:p>
-    <w:p>
-      <w:r>
-        <w:t>-</w:t>
-      </w:r>
-      <w:r>
-        <w:t xml:space="preserve"> Source</w:t>
-      </w:r>
-      <w:r>
-        <w:t xml:space="preserve"> Primary keys </w:t>
-      </w:r>
-      <w:proofErr w:type="gramStart"/>
-      <w:r>
-        <w:t>is</w:t>
-      </w:r>
-      <w:proofErr w:type="gramEnd"/>
-      <w:r>
-        <w:t xml:space="preserve"> the</w:t>
-      </w:r>
-      <w:r>
-        <w:t xml:space="preserve"> PK </w:t>
-      </w:r>
-      <w:r>
-        <w:t>of the Source entity</w:t>
-      </w:r>
-    </w:p>
-    <w:p>
-      <w:r>
-        <w:t xml:space="preserve">- Target Primary key is the PK of the Related </w:t>
-      </w:r>
-      <w:proofErr w:type="spellStart"/>
-      <w:r>
-        <w:t>entitiy</w:t>
-      </w:r>
-      <w:proofErr w:type="spellEnd"/>
-    </w:p>
-    <w:p>
-      <w:r>
-        <w:t xml:space="preserve">- </w:t>
-      </w:r>
-      <w:proofErr w:type="spellStart"/>
-      <w:r>
-        <w:t>RelationshipType</w:t>
-      </w:r>
-      <w:proofErr w:type="spellEnd"/>
-      <w:r>
-        <w:t xml:space="preserve"> must match metadata from JSON</w:t>
-      </w:r>
-    </w:p>
-    <w:p/>
-    <w:p>
-      <w:r>
-        <w:t>Implement endpoint:</w:t>
-      </w:r>
-    </w:p>
-    <w:p>
-      <w:r>
-        <w:t>`POST /generate-mapping` → returns JSON mapping file</w:t>
-      </w:r>
-    </w:p>
-    <w:p/>
-    <w:p>
-      <w:r>
-        <w:t>### 6. API Endpoints needed</w:t>
-      </w:r>
-    </w:p>
-    <w:p>
-      <w:r>
-        <w:t>- GET /entities</w:t>
-      </w:r>
-    </w:p>
-    <w:p>
-      <w:r>
-        <w:t>- GET /</w:t>
-      </w:r>
-      <w:proofErr w:type="gramStart"/>
-      <w:r>
-        <w:t>entities/{</w:t>
-      </w:r>
-      <w:proofErr w:type="spellStart"/>
-      <w:r>
-        <w:t>entityName</w:t>
-      </w:r>
-      <w:proofErr w:type="spellEnd"/>
-      <w:r>
-        <w:t>}/</w:t>
-      </w:r>
-      <w:proofErr w:type="gramEnd"/>
-      <w:r>
-        <w:t>structure</w:t>
-      </w:r>
-    </w:p>
-    <w:p>
-      <w:r>
-        <w:t>- GET /</w:t>
-      </w:r>
-      <w:proofErr w:type="gramStart"/>
-      <w:r>
-        <w:t>entities/{</w:t>
-      </w:r>
-      <w:proofErr w:type="spellStart"/>
-      <w:r>
-        <w:t>entityName</w:t>
-      </w:r>
-      <w:proofErr w:type="spellEnd"/>
-      <w:r>
-        <w:t>}/</w:t>
-      </w:r>
-      <w:proofErr w:type="gramEnd"/>
-      <w:r>
-        <w:t>related</w:t>
-      </w:r>
-    </w:p>
-    <w:p>
-      <w:r>
-        <w:t>- POST /generate-data</w:t>
-      </w:r>
-    </w:p>
-    <w:p>
-      <w:r>
-        <w:t>- POST /generate-mapping</w:t>
-      </w:r>
-    </w:p>
-    <w:p>
-      <w:r>
-        <w:t>- POST /define-pk-rules</w:t>
-      </w:r>
-    </w:p>
-    <w:p>
-      <w:r>
         <w:t>- POST /define-field-rules</w:t>
       </w:r>
     </w:p>
@@ -731,7 +767,6 @@
     </w:p>
     <w:p>
       <w:r>
-        <w:lastRenderedPageBreak/>
         <w:t xml:space="preserve">  - </w:t>
       </w:r>
       <w:proofErr w:type="spellStart"/>
@@ -915,7 +950,6 @@
         <w:ind w:left="720"/>
       </w:pPr>
       <w:r>
-        <w:lastRenderedPageBreak/>
         <w:t>- Choose composite keys</w:t>
       </w:r>
     </w:p>
@@ -1027,6 +1061,7 @@
     <w:p/>
     <w:p>
       <w:r>
+        <w:lastRenderedPageBreak/>
         <w:t>UI then:</w:t>
       </w:r>
     </w:p>
@@ -1166,6 +1201,7 @@
     <w:p/>
     <w:p>
       <w:r>
+        <w:lastRenderedPageBreak/>
         <w:t>1. Use seeded Random for deterministic behavior</w:t>
       </w:r>
     </w:p>
@@ -1207,7 +1243,6 @@
     </w:p>
     <w:p>
       <w:r>
-        <w:lastRenderedPageBreak/>
         <w:t xml:space="preserve">   - Maintain incremental counters if required</w:t>
       </w:r>
     </w:p>
@@ -1362,6 +1397,7 @@
     </w:p>
     <w:p>
       <w:r>
+        <w:lastRenderedPageBreak/>
         <w:t>- Test data generator</w:t>
       </w:r>
     </w:p>
@@ -1383,7 +1419,6 @@
     </w:p>
     <w:p>
       <w:r>
-        <w:lastRenderedPageBreak/>
         <w:t>- Page layout + routing</w:t>
       </w:r>
     </w:p>
@@ -1594,7 +1629,11 @@
       <w:proofErr w:type="spellEnd"/>
       <w:proofErr w:type="gramEnd"/>
       <w:r>
-        <w:t xml:space="preserve"> should have the </w:t>
+        <w:t xml:space="preserve"> should </w:t>
+      </w:r>
+      <w:r>
+        <w:lastRenderedPageBreak/>
+        <w:t xml:space="preserve">have the </w:t>
       </w:r>
       <w:proofErr w:type="spellStart"/>
       <w:r>
@@ -1687,11 +1726,7 @@
       </w:r>
       <w:r>
         <w:tab/>
-        <w:t xml:space="preserve">Relationship Type. The </w:t>
-      </w:r>
-      <w:r>
-        <w:lastRenderedPageBreak/>
-        <w:t xml:space="preserve">Source Primary key is the </w:t>
+        <w:t xml:space="preserve">Relationship Type. The Source Primary key is the </w:t>
       </w:r>
       <w:proofErr w:type="spellStart"/>
       <w:proofErr w:type="gramStart"/>
@@ -2000,6 +2035,7 @@
         <w:rPr>
           <w:highlight w:val="yellow"/>
         </w:rPr>
+        <w:lastRenderedPageBreak/>
         <w:t>Operations Event and Event Property:</w:t>
       </w:r>
     </w:p>
@@ -2095,11 +2131,7 @@
       </w:r>
       <w:proofErr w:type="spellEnd"/>
       <w:r>
-        <w:t xml:space="preserve">: BREADBLAST10, BREADBLAST11, BREADBLAST12, BREADBLAST20, BREADBLAST21. Entity Operations </w:t>
-      </w:r>
-      <w:r>
-        <w:lastRenderedPageBreak/>
-        <w:t xml:space="preserve">Event the </w:t>
+        <w:t xml:space="preserve">: BREADBLAST10, BREADBLAST11, BREADBLAST12, BREADBLAST20, BREADBLAST21. Entity Operations Event the </w:t>
       </w:r>
       <w:proofErr w:type="spellStart"/>
       <w:r>
@@ -2929,7 +2961,6 @@
   <w:style w:type="character" w:default="1" w:styleId="DefaultParagraphFont">
     <w:name w:val="Default Paragraph Font"/>
     <w:uiPriority w:val="1"/>
-    <w:semiHidden/>
     <w:unhideWhenUsed/>
   </w:style>
   <w:style w:type="table" w:default="1" w:styleId="TableNormal">

</xml_diff>